<commit_message>
module 3 project: prompts-only handout with the RIL FY25 annual report in the zip, python route removed
</commit_message>
<xml_diff>
--- a/labs/3-agent-investment-memo/3 Agent Investment Memo.docx
+++ b/labs/3-agent-investment-memo/3 Agent Investment Memo.docx
@@ -77,7 +77,20 @@
           <w:color w:val="1B2A41"/>
           <w:sz w:val="22"/>
         </w:rPr>
-        <w:t>The project is free. It needs no API key and no installs. Run it either way below.</w:t>
+        <w:t>In class we run the same three agents in Claude Code, where each agent is a real AI agent. At home you run them by hand in any free AI chat. The shape is identical.</w:t>
+      </w:r>
+    </w:p>
+    <w:p>
+      <w:pPr>
+        <w:spacing w:after="120" w:before="0"/>
+      </w:pPr>
+      <w:r>
+        <w:rPr>
+          <w:b w:val="0"/>
+          <w:color w:val="1B2A41"/>
+          <w:sz w:val="22"/>
+        </w:rPr>
+        <w:t>The project is free. It needs no API key, no installs and no code.</w:t>
       </w:r>
     </w:p>
     <w:p>
@@ -90,7 +103,7 @@
           <w:color w:val="0F2145"/>
           <w:sz w:val="30"/>
         </w:rPr>
-        <w:t>Route 1 — run the three agents in any free AI chat</w:t>
+        <w:t>How to run it — three prompts in any free AI chat</w:t>
       </w:r>
     </w:p>
     <w:p>
@@ -611,7 +624,7 @@
           <w:color w:val="1B2A41"/>
           <w:sz w:val="22"/>
         </w:rPr>
-        <w:t>Fill Prompt 1 like this. These are Reliance's published consolidated figures for FY2024-25, from its results on ril.com.</w:t>
+        <w:t>Fill Prompt 1 like this. These are Reliance's published consolidated figures for FY2024-25. The annual report itself is in this folder (RIL-Integrated-Annual-Report-2024-25.pdf), so you can verify every number against it.</w:t>
       </w:r>
     </w:p>
     <w:p>
@@ -713,19 +726,6 @@
     </w:p>
     <w:p>
       <w:pPr>
-        <w:spacing w:after="80" w:before="280"/>
-      </w:pPr>
-      <w:r>
-        <w:rPr>
-          <w:b/>
-          <w:color w:val="0F2145"/>
-          <w:sz w:val="30"/>
-        </w:rPr>
-        <w:t>Route 2 — run the Python pipeline</w:t>
-      </w:r>
-    </w:p>
-    <w:p>
-      <w:pPr>
         <w:spacing w:after="120" w:before="0"/>
       </w:pPr>
       <w:r>
@@ -734,60 +734,7 @@
           <w:color w:val="1B2A41"/>
           <w:sz w:val="22"/>
         </w:rPr>
-        <w:t>You need Python 3 and nothing else. In this folder, run:</w:t>
-      </w:r>
-    </w:p>
-    <w:p>
-      <w:pPr>
-        <w:spacing w:after="40"/>
-        <w:ind w:left="360"/>
-      </w:pPr>
-      <w:r>
-        <w:rPr>
-          <w:rFonts w:ascii="Consolas" w:hAnsi="Consolas"/>
-          <w:color w:val="1B2A41"/>
-          <w:sz w:val="20"/>
-        </w:rPr>
-        <w:t>python3 memo_pipeline.py</w:t>
-      </w:r>
-    </w:p>
-    <w:p>
-      <w:pPr>
-        <w:spacing w:after="120" w:before="120"/>
-      </w:pPr>
-      <w:r>
-        <w:rPr>
-          <w:b w:val="0"/>
-          <w:color w:val="1B2A41"/>
-          <w:sz w:val="22"/>
-        </w:rPr>
-        <w:t>The script reads company_facts.csv and writes three files into output/: the research notes, the analysis, and the memo. Read them in order. That order is the hand-off.</w:t>
-      </w:r>
-    </w:p>
-    <w:p>
-      <w:pPr>
-        <w:spacing w:after="120" w:before="0"/>
-      </w:pPr>
-      <w:r>
-        <w:rPr>
-          <w:b w:val="0"/>
-          <w:color w:val="1B2A41"/>
-          <w:sz w:val="22"/>
-        </w:rPr>
-        <w:t>The CSV ships with the same Reliance Industries figures as above. Swap in any NSE company's numbers from its published results and run it again. Keep the same columns.</w:t>
-      </w:r>
-    </w:p>
-    <w:p>
-      <w:pPr>
-        <w:spacing w:after="120" w:before="0"/>
-      </w:pPr>
-      <w:r>
-        <w:rPr>
-          <w:b w:val="0"/>
-          <w:color w:val="1B2A41"/>
-          <w:sz w:val="22"/>
-        </w:rPr>
-        <w:t>In class we run the same pipeline in Claude Code, where each agent is a real AI agent instead of a Python function. The shape is identical.</w:t>
+        <w:t>Repeat it with any NSE company. Take the same five numbers from that company's annual report or screener.in.</w:t>
       </w:r>
     </w:p>
     <w:p>
@@ -813,7 +760,7 @@
           <w:color w:val="1B2A41"/>
           <w:sz w:val="22"/>
         </w:rPr>
-        <w:t>When the memo comes back, check every number against your sources. If one is wrong or unsourced, tell the chat what failed and make it redraft. That rejection loop is Module 3's whole point.</w:t>
+        <w:t>When the memo comes back, check every number against the annual report. If one is wrong or unsourced, tell the chat what failed and make it redraft. That rejection loop is Module 3's whole point.</w:t>
       </w:r>
     </w:p>
     <w:p>

</xml_diff>